<commit_message>
feat: modernize GLV dashboards
</commit_message>
<xml_diff>
--- a/docs/GLV_Dashboard_and_Business_Overview_Guide.docx
+++ b/docs/GLV_Dashboard_and_Business_Overview_Guide.docx
@@ -1335,6 +1335,137 @@
                 <w:b/>
                 <w:sz w:val="16"/>
               </w:rPr>
+              <w:t>Amount Deposited This Week</w:t>
+            </w:r>
+          </w:p>
+        </w:tc>
+        <w:tc>
+          <w:tcPr>
+            <w:tcW w:type="dxa" w:w="3384"/>
+            <w:vAlign w:val="center"/>
+            <w:tcBorders>
+              <w:top w:val="single" w:sz="4" w:color="D9D9D9"/>
+              <w:left w:val="single" w:sz="4" w:color="D9D9D9"/>
+              <w:bottom w:val="single" w:sz="4" w:color="D9D9D9"/>
+              <w:right w:val="single" w:sz="4" w:color="D9D9D9"/>
+              <w:insideH w:val="single" w:sz="4" w:color="D9D9D9"/>
+              <w:insideV w:val="single" w:sz="4" w:color="D9D9D9"/>
+            </w:tcBorders>
+            <w:tcMar>
+              <w:top w:w="100" w:type="dxa"/>
+              <w:start w:w="120" w:type="dxa"/>
+              <w:bottom w:w="100" w:type="dxa"/>
+              <w:end w:w="120" w:type="dxa"/>
+            </w:tcMar>
+          </w:tcPr>
+          <w:p>
+            <w:pPr>
+              <w:spacing w:after="0"/>
+            </w:pPr>
+            <w:r>
+              <w:rPr>
+                <w:b w:val="0"/>
+                <w:sz w:val="16"/>
+              </w:rPr>
+              <w:t>Staff deposits entered for the current week.</w:t>
+            </w:r>
+          </w:p>
+        </w:tc>
+        <w:tc>
+          <w:tcPr>
+            <w:tcW w:type="dxa" w:w="3240"/>
+            <w:vAlign w:val="center"/>
+            <w:tcBorders>
+              <w:top w:val="single" w:sz="4" w:color="D9D9D9"/>
+              <w:left w:val="single" w:sz="4" w:color="D9D9D9"/>
+              <w:bottom w:val="single" w:sz="4" w:color="D9D9D9"/>
+              <w:right w:val="single" w:sz="4" w:color="D9D9D9"/>
+              <w:insideH w:val="single" w:sz="4" w:color="D9D9D9"/>
+              <w:insideV w:val="single" w:sz="4" w:color="D9D9D9"/>
+            </w:tcBorders>
+            <w:tcMar>
+              <w:top w:w="100" w:type="dxa"/>
+              <w:start w:w="120" w:type="dxa"/>
+              <w:bottom w:w="100" w:type="dxa"/>
+              <w:end w:w="120" w:type="dxa"/>
+            </w:tcMar>
+          </w:tcPr>
+          <w:p>
+            <w:pPr>
+              <w:spacing w:after="0"/>
+            </w:pPr>
+            <w:r>
+              <w:rPr>
+                <w:b w:val="0"/>
+                <w:sz w:val="16"/>
+              </w:rPr>
+              <w:t>Sum of Staff Deposit amounts by deposit date for Monday through Sunday.</w:t>
+            </w:r>
+          </w:p>
+        </w:tc>
+        <w:tc>
+          <w:tcPr>
+            <w:tcW w:type="dxa" w:w="1656"/>
+            <w:vAlign w:val="center"/>
+            <w:tcBorders>
+              <w:top w:val="single" w:sz="4" w:color="D9D9D9"/>
+              <w:left w:val="single" w:sz="4" w:color="D9D9D9"/>
+              <w:bottom w:val="single" w:sz="4" w:color="D9D9D9"/>
+              <w:right w:val="single" w:sz="4" w:color="D9D9D9"/>
+              <w:insideH w:val="single" w:sz="4" w:color="D9D9D9"/>
+              <w:insideV w:val="single" w:sz="4" w:color="D9D9D9"/>
+            </w:tcBorders>
+            <w:tcMar>
+              <w:top w:w="100" w:type="dxa"/>
+              <w:start w:w="120" w:type="dxa"/>
+              <w:bottom w:w="100" w:type="dxa"/>
+              <w:end w:w="120" w:type="dxa"/>
+            </w:tcMar>
+          </w:tcPr>
+          <w:p>
+            <w:pPr>
+              <w:spacing w:after="0"/>
+            </w:pPr>
+            <w:r>
+              <w:rPr>
+                <w:b w:val="0"/>
+                <w:sz w:val="16"/>
+              </w:rPr>
+              <w:t>Banked cash timing can differ from customer payment timing; this is not new revenue.</w:t>
+            </w:r>
+          </w:p>
+        </w:tc>
+      </w:tr>
+      <w:tr>
+        <w:tc>
+          <w:tcPr>
+            <w:tcW w:type="dxa" w:w="1944"/>
+            <w:shd w:fill="F4F7FB"/>
+            <w:vAlign w:val="center"/>
+            <w:tcBorders>
+              <w:top w:val="single" w:sz="4" w:color="D9D9D9"/>
+              <w:left w:val="single" w:sz="4" w:color="D9D9D9"/>
+              <w:bottom w:val="single" w:sz="4" w:color="D9D9D9"/>
+              <w:right w:val="single" w:sz="4" w:color="D9D9D9"/>
+              <w:insideH w:val="single" w:sz="4" w:color="D9D9D9"/>
+              <w:insideV w:val="single" w:sz="4" w:color="D9D9D9"/>
+            </w:tcBorders>
+            <w:tcMar>
+              <w:top w:w="100" w:type="dxa"/>
+              <w:start w:w="120" w:type="dxa"/>
+              <w:bottom w:w="100" w:type="dxa"/>
+              <w:end w:w="120" w:type="dxa"/>
+            </w:tcMar>
+          </w:tcPr>
+          <w:p>
+            <w:pPr>
+              <w:spacing w:after="0"/>
+            </w:pPr>
+            <w:r>
+              <w:rPr>
+                <w:b/>
+                <w:sz w:val="16"/>
+              </w:rPr>
               <w:t>Expected Receivables</w:t>
             </w:r>
           </w:p>
@@ -1342,6 +1473,7 @@
         <w:tc>
           <w:tcPr>
             <w:tcW w:type="dxa" w:w="3384"/>
+            <w:shd w:fill="F4F7FB"/>
             <w:vAlign w:val="center"/>
             <w:tcBorders>
               <w:top w:val="single" w:sz="4" w:color="D9D9D9"/>
@@ -1374,6 +1506,7 @@
         <w:tc>
           <w:tcPr>
             <w:tcW w:type="dxa" w:w="3240"/>
+            <w:shd w:fill="F4F7FB"/>
             <w:vAlign w:val="center"/>
             <w:tcBorders>
               <w:top w:val="single" w:sz="4" w:color="D9D9D9"/>
@@ -1406,6 +1539,7 @@
         <w:tc>
           <w:tcPr>
             <w:tcW w:type="dxa" w:w="1656"/>
+            <w:shd w:fill="F4F7FB"/>
             <w:vAlign w:val="center"/>
             <w:tcBorders>
               <w:top w:val="single" w:sz="4" w:color="D9D9D9"/>
@@ -1440,7 +1574,6 @@
         <w:tc>
           <w:tcPr>
             <w:tcW w:type="dxa" w:w="1944"/>
-            <w:shd w:fill="F4F7FB"/>
             <w:vAlign w:val="center"/>
             <w:tcBorders>
               <w:top w:val="single" w:sz="4" w:color="D9D9D9"/>
@@ -1473,7 +1606,6 @@
         <w:tc>
           <w:tcPr>
             <w:tcW w:type="dxa" w:w="3384"/>
-            <w:shd w:fill="F4F7FB"/>
             <w:vAlign w:val="center"/>
             <w:tcBorders>
               <w:top w:val="single" w:sz="4" w:color="D9D9D9"/>
@@ -1506,7 +1638,6 @@
         <w:tc>
           <w:tcPr>
             <w:tcW w:type="dxa" w:w="3240"/>
-            <w:shd w:fill="F4F7FB"/>
             <w:vAlign w:val="center"/>
             <w:tcBorders>
               <w:top w:val="single" w:sz="4" w:color="D9D9D9"/>
@@ -1539,7 +1670,6 @@
         <w:tc>
           <w:tcPr>
             <w:tcW w:type="dxa" w:w="1656"/>
-            <w:shd w:fill="F4F7FB"/>
             <w:vAlign w:val="center"/>
             <w:tcBorders>
               <w:top w:val="single" w:sz="4" w:color="D9D9D9"/>
@@ -4558,6 +4688,137 @@
                 <w:b/>
                 <w:sz w:val="16"/>
               </w:rPr>
+              <w:t>My Deposits This Week</w:t>
+            </w:r>
+          </w:p>
+        </w:tc>
+        <w:tc>
+          <w:tcPr>
+            <w:tcW w:type="dxa" w:w="3384"/>
+            <w:vAlign w:val="center"/>
+            <w:tcBorders>
+              <w:top w:val="single" w:sz="4" w:color="D9D9D9"/>
+              <w:left w:val="single" w:sz="4" w:color="D9D9D9"/>
+              <w:bottom w:val="single" w:sz="4" w:color="D9D9D9"/>
+              <w:right w:val="single" w:sz="4" w:color="D9D9D9"/>
+              <w:insideH w:val="single" w:sz="4" w:color="D9D9D9"/>
+              <w:insideV w:val="single" w:sz="4" w:color="D9D9D9"/>
+            </w:tcBorders>
+            <w:tcMar>
+              <w:top w:w="100" w:type="dxa"/>
+              <w:start w:w="120" w:type="dxa"/>
+              <w:bottom w:w="100" w:type="dxa"/>
+              <w:end w:w="120" w:type="dxa"/>
+            </w:tcMar>
+          </w:tcPr>
+          <w:p>
+            <w:pPr>
+              <w:spacing w:after="0"/>
+            </w:pPr>
+            <w:r>
+              <w:rPr>
+                <w:b w:val="0"/>
+                <w:sz w:val="16"/>
+              </w:rPr>
+              <w:t>Staff deposits recorded for the signed-in staff member.</w:t>
+            </w:r>
+          </w:p>
+        </w:tc>
+        <w:tc>
+          <w:tcPr>
+            <w:tcW w:type="dxa" w:w="3240"/>
+            <w:vAlign w:val="center"/>
+            <w:tcBorders>
+              <w:top w:val="single" w:sz="4" w:color="D9D9D9"/>
+              <w:left w:val="single" w:sz="4" w:color="D9D9D9"/>
+              <w:bottom w:val="single" w:sz="4" w:color="D9D9D9"/>
+              <w:right w:val="single" w:sz="4" w:color="D9D9D9"/>
+              <w:insideH w:val="single" w:sz="4" w:color="D9D9D9"/>
+              <w:insideV w:val="single" w:sz="4" w:color="D9D9D9"/>
+            </w:tcBorders>
+            <w:tcMar>
+              <w:top w:w="100" w:type="dxa"/>
+              <w:start w:w="120" w:type="dxa"/>
+              <w:bottom w:w="100" w:type="dxa"/>
+              <w:end w:w="120" w:type="dxa"/>
+            </w:tcMar>
+          </w:tcPr>
+          <w:p>
+            <w:pPr>
+              <w:spacing w:after="0"/>
+            </w:pPr>
+            <w:r>
+              <w:rPr>
+                <w:b w:val="0"/>
+                <w:sz w:val="16"/>
+              </w:rPr>
+              <w:t>Sum of that staff member's Staff Deposit amounts by deposit date in the current week.</w:t>
+            </w:r>
+          </w:p>
+        </w:tc>
+        <w:tc>
+          <w:tcPr>
+            <w:tcW w:type="dxa" w:w="1656"/>
+            <w:vAlign w:val="center"/>
+            <w:tcBorders>
+              <w:top w:val="single" w:sz="4" w:color="D9D9D9"/>
+              <w:left w:val="single" w:sz="4" w:color="D9D9D9"/>
+              <w:bottom w:val="single" w:sz="4" w:color="D9D9D9"/>
+              <w:right w:val="single" w:sz="4" w:color="D9D9D9"/>
+              <w:insideH w:val="single" w:sz="4" w:color="D9D9D9"/>
+              <w:insideV w:val="single" w:sz="4" w:color="D9D9D9"/>
+            </w:tcBorders>
+            <w:tcMar>
+              <w:top w:w="100" w:type="dxa"/>
+              <w:start w:w="120" w:type="dxa"/>
+              <w:bottom w:w="100" w:type="dxa"/>
+              <w:end w:w="120" w:type="dxa"/>
+            </w:tcMar>
+          </w:tcPr>
+          <w:p>
+            <w:pPr>
+              <w:spacing w:after="0"/>
+            </w:pPr>
+            <w:r>
+              <w:rPr>
+                <w:b w:val="0"/>
+                <w:sz w:val="16"/>
+              </w:rPr>
+              <w:t>Deposits are not customer collections; timing may differ.</w:t>
+            </w:r>
+          </w:p>
+        </w:tc>
+      </w:tr>
+      <w:tr>
+        <w:tc>
+          <w:tcPr>
+            <w:tcW w:type="dxa" w:w="1944"/>
+            <w:shd w:fill="F4F7FB"/>
+            <w:vAlign w:val="center"/>
+            <w:tcBorders>
+              <w:top w:val="single" w:sz="4" w:color="D9D9D9"/>
+              <w:left w:val="single" w:sz="4" w:color="D9D9D9"/>
+              <w:bottom w:val="single" w:sz="4" w:color="D9D9D9"/>
+              <w:right w:val="single" w:sz="4" w:color="D9D9D9"/>
+              <w:insideH w:val="single" w:sz="4" w:color="D9D9D9"/>
+              <w:insideV w:val="single" w:sz="4" w:color="D9D9D9"/>
+            </w:tcBorders>
+            <w:tcMar>
+              <w:top w:w="100" w:type="dxa"/>
+              <w:start w:w="120" w:type="dxa"/>
+              <w:bottom w:w="100" w:type="dxa"/>
+              <w:end w:w="120" w:type="dxa"/>
+            </w:tcMar>
+          </w:tcPr>
+          <w:p>
+            <w:pPr>
+              <w:spacing w:after="0"/>
+            </w:pPr>
+            <w:r>
+              <w:rPr>
+                <w:b/>
+                <w:sz w:val="16"/>
+              </w:rPr>
               <w:t>Awaiting Delivery</w:t>
             </w:r>
           </w:p>
@@ -4565,6 +4826,7 @@
         <w:tc>
           <w:tcPr>
             <w:tcW w:type="dxa" w:w="3384"/>
+            <w:shd w:fill="F4F7FB"/>
             <w:vAlign w:val="center"/>
             <w:tcBorders>
               <w:top w:val="single" w:sz="4" w:color="D9D9D9"/>
@@ -4597,6 +4859,7 @@
         <w:tc>
           <w:tcPr>
             <w:tcW w:type="dxa" w:w="3240"/>
+            <w:shd w:fill="F4F7FB"/>
             <w:vAlign w:val="center"/>
             <w:tcBorders>
               <w:top w:val="single" w:sz="4" w:color="D9D9D9"/>
@@ -4629,6 +4892,7 @@
         <w:tc>
           <w:tcPr>
             <w:tcW w:type="dxa" w:w="1656"/>
+            <w:shd w:fill="F4F7FB"/>
             <w:vAlign w:val="center"/>
             <w:tcBorders>
               <w:top w:val="single" w:sz="4" w:color="D9D9D9"/>
@@ -4733,6 +4997,20 @@
     <w:p>
       <w:r>
         <w:br w:type="page"/>
+      </w:r>
+    </w:p>
+    <w:p>
+      <w:pPr>
+        <w:pStyle w:val="Heading1"/>
+        <w:keepNext/>
+      </w:pPr>
+      <w:r>
+        <w:t>Trend and breakdown charts</w:t>
+      </w:r>
+    </w:p>
+    <w:p>
+      <w:r>
+        <w:t>Dashboard, Reports, Activity, and Business Management charts use curved trend lines for values over time, with a color key and accessible hover/focus details. Donut charts show category shares with a value and percentage key. Ranked dot plots compare staff and product values along a shared numeric scale. Collections and deposits are separate series because deposit dates may differ from customer payment dates. The Business Management cash movement chart compares recorded payments, salary payments, and operating expenses by calendar month; it is a cash movement view, not an accounting profit statement. Expense category shares use recorded expense dates in the current month.</w:t>
       </w:r>
     </w:p>
     <w:tbl>

</xml_diff>

<commit_message>
style: restore admin dashboard KPI cards
</commit_message>
<xml_diff>
--- a/docs/GLV_Dashboard_and_Business_Overview_Guide.docx
+++ b/docs/GLV_Dashboard_and_Business_Overview_Guide.docx
@@ -92,6 +92,11 @@
     <w:p>
       <w:r>
         <w:t>Use counts to monitor workload and account health. Use collection and receivable figures to understand customer cash flow. Use product cost, procurement, payroll, and profit figures together; no single card represents cash in the bank or final accounting profit. Currency figures use the system’s configured currency, normally Ghana cedis.</w:t>
+      </w:r>
+    </w:p>
+    <w:p>
+      <w:r>
+        <w:t>Administrator dashboard KPI cards use the compact summary style; use the trend charts below them for period comparisons. Staff dashboards retain their own scoped KPI indicators where dated history supports a comparison.</w:t>
       </w:r>
     </w:p>
     <w:p>

</xml_diff>